<commit_message>
Replace translation with a sentence-by-sentence technical translation
One Russian sentence per English sentence (39/39), same paragraph
structure, no paraphrasing; glossary terms marked with their numbers.
Drops the paraphrased HTML version.

Co-Authored-By: Claude Opus 5.5 <noreply@anthropic.com>
Claude-Session: https://claude.ai/code/session_013Xxu2m9CWM8tKPgDAjjPtT
</commit_message>
<xml_diff>
--- a/isppr-translation/Landwehr_2022_fragment_translation_RU.docx
+++ b/isppr-translation/Landwehr_2022_fragment_translation_RU.docx
@@ -30,7 +30,7 @@
           <w:sz w:val="28"/>
           <w:szCs w:val="28"/>
         </w:rPr>
-        <w:t xml:space="preserve">Знания о проектировании систем поддержки принятия решений на основе изображений с применением глубокого обучения: опыт принятия решений по техническому обслуживанию линий электропередачи</w:t>
+        <w:t xml:space="preserve">Знания о проектировании систем поддержки принятия решений на основе изображений с использованием глубокого обучения: данные из практики принятия решений по техническому обслуживанию линий электропередачи</w:t>
       </w:r>
     </w:p>
     <w:p>
@@ -141,15 +141,15 @@
       <w:pPr>
         <w:spacing w:after="0" w:line="360"/>
         <w:ind w:firstLine="709"/>
-        <w:jc w:val="both"/>
-      </w:pPr>
-      <w:r>
-        <w:rPr>
-          <w:rFonts w:ascii="Times New Roman" w:cs="Times New Roman" w:eastAsia="Times New Roman" w:hAnsi="Times New Roman"/>
-          <w:sz w:val="28"/>
-          <w:szCs w:val="28"/>
-        </w:rPr>
-        <w:t xml:space="preserve">Доступ ко всё возрастающим объёмам изображений и возможности </w:t>
+        <w:jc w:val="left"/>
+      </w:pPr>
+      <w:r>
+        <w:rPr>
+          <w:rFonts w:ascii="Times New Roman" w:cs="Times New Roman" w:eastAsia="Times New Roman" w:hAnsi="Times New Roman"/>
+          <w:sz w:val="28"/>
+          <w:szCs w:val="28"/>
+        </w:rPr>
+        <w:t xml:space="preserve">Доступ к растущим объёмам изображений и возможности </w:t>
       </w:r>
       <w:r>
         <w:rPr>
@@ -182,7 +182,7 @@
           <w:sz w:val="28"/>
           <w:szCs w:val="28"/>
         </w:rPr>
-        <w:t xml:space="preserve"> по обработке изображений и извлечению из них информации открывают перспективы использования этих обширных данных и методов </w:t>
+        <w:t xml:space="preserve"> по обработке изображений и извлечению из них информации создают потенциал для использования этих богатых данных и методов </w:t>
       </w:r>
       <w:r>
         <w:rPr>
@@ -215,7 +215,7 @@
           <w:sz w:val="28"/>
           <w:szCs w:val="28"/>
         </w:rPr>
-        <w:t xml:space="preserve"> для повышения эффективности принятия решений (Chaudhuri and Bose 2020). Несмотря на свои возможности, методы </w:t>
+        <w:t xml:space="preserve"> с целью содействия эффективному принятию решений (Chaudhuri and Bose 2020). Несмотря на свои возможности, методы </w:t>
       </w:r>
       <w:r>
         <w:rPr>
@@ -248,7 +248,7 @@
           <w:sz w:val="28"/>
           <w:szCs w:val="28"/>
         </w:rPr>
-        <w:t xml:space="preserve">, в особенности </w:t>
+        <w:t xml:space="preserve">, в частности </w:t>
       </w:r>
       <w:r>
         <w:rPr>
@@ -281,7 +281,7 @@
           <w:sz w:val="28"/>
           <w:szCs w:val="28"/>
         </w:rPr>
-        <w:t xml:space="preserve">, пока нашли ограниченное применение в существующих исследованиях в области </w:t>
+        <w:t xml:space="preserve">, нашли ограниченное применение в существующих исследованиях </w:t>
       </w:r>
       <w:r>
         <w:rPr>
@@ -314,7 +314,7 @@
           <w:sz w:val="28"/>
           <w:szCs w:val="28"/>
         </w:rPr>
-        <w:t xml:space="preserve"> в целом (Kraus et al. 2020) и </w:t>
+        <w:t xml:space="preserve"> (ИС) в целом (Kraus et al. 2020) и </w:t>
       </w:r>
       <w:r>
         <w:rPr>
@@ -347,7 +347,7 @@
           <w:sz w:val="28"/>
           <w:szCs w:val="28"/>
         </w:rPr>
-        <w:t xml:space="preserve"> в частности. Большинство исследований, посвящённых поддержке принятия решений на основе изображений, относится к медицинской </w:t>
+        <w:t xml:space="preserve"> (СППР) в частности. Большинство исследований, выполненных в области поддержки принятия решений на основе изображений, сосредоточено на медицинской </w:t>
       </w:r>
       <w:r>
         <w:rPr>
@@ -380,7 +380,7 @@
           <w:sz w:val="28"/>
           <w:szCs w:val="28"/>
         </w:rPr>
-        <w:t xml:space="preserve"> (Ben-Cohen et al. 2017; Comaniciu et al. 1999). Однако в этих работах используются узкоспециализированные медицинские снимки, а не изображения видимого спектра. Среди немногочисленных публикаций о поддержке принятия решений на основе изображений с применением </w:t>
+        <w:t xml:space="preserve"> (Ben-Cohen et al. 2017; Comaniciu et al. 1999). Однако в этих работах используются узкоспециализированные медицинские снимки, а не изображения видимого спектра. Некоторые примеры немногочисленной литературы по поддержке принятия решений на основе изображений с использованием </w:t>
       </w:r>
       <w:r>
         <w:rPr>
@@ -413,7 +413,7 @@
           <w:sz w:val="28"/>
           <w:szCs w:val="28"/>
         </w:rPr>
-        <w:t xml:space="preserve"> в немедицинских областях можно назвать приложения для технического обслуживания и мониторинга </w:t>
+        <w:t xml:space="preserve"> в немедицинских контекстах включают приложения для технического обслуживания и мониторинга </w:t>
       </w:r>
       <w:r>
         <w:rPr>
@@ -446,20 +446,20 @@
           <w:sz w:val="28"/>
           <w:szCs w:val="28"/>
         </w:rPr>
-        <w:t xml:space="preserve">, а также работы по </w:t>
-      </w:r>
-      <w:r>
-        <w:rPr>
-          <w:rFonts w:ascii="Times New Roman" w:cs="Times New Roman" w:eastAsia="Times New Roman" w:hAnsi="Times New Roman"/>
-          <w:b/>
-          <w:bCs/>
-          <w:i w:val="false"/>
-          <w:iCs w:val="false"/>
-          <w:color w:val="1F4E79"/>
-          <w:sz w:val="28"/>
-          <w:szCs w:val="28"/>
-        </w:rPr>
-        <w:t xml:space="preserve">анализу образов</w:t>
+        <w:t xml:space="preserve"> или </w:t>
+      </w:r>
+      <w:r>
+        <w:rPr>
+          <w:rFonts w:ascii="Times New Roman" w:cs="Times New Roman" w:eastAsia="Times New Roman" w:hAnsi="Times New Roman"/>
+          <w:b/>
+          <w:bCs/>
+          <w:i w:val="false"/>
+          <w:iCs w:val="false"/>
+          <w:color w:val="1F4E79"/>
+          <w:sz w:val="28"/>
+          <w:szCs w:val="28"/>
+        </w:rPr>
+        <w:t xml:space="preserve">анализ образов</w:t>
       </w:r>
       <w:r>
         <w:rPr>
@@ -486,7 +486,7 @@
       <w:pPr>
         <w:spacing w:after="0" w:line="360"/>
         <w:ind w:firstLine="709"/>
-        <w:jc w:val="both"/>
+        <w:jc w:val="left"/>
       </w:pPr>
       <w:r>
         <w:rPr>
@@ -527,7 +527,7 @@
           <w:sz w:val="28"/>
           <w:szCs w:val="28"/>
         </w:rPr>
-        <w:t xml:space="preserve"> для обработки изображений в смежных задачах поддержки принятия решений, ни в одной из предшествующих работ не даётся рекомендаций по проектированию </w:t>
+        <w:t xml:space="preserve"> для обработки изображений в смежных контекстах поддержки принятия решений, ни одна из предыдущих работ не даёт рекомендаций о том, как проектировать </w:t>
       </w:r>
       <w:r>
         <w:rPr>
@@ -560,7 +560,7 @@
           <w:sz w:val="28"/>
           <w:szCs w:val="28"/>
         </w:rPr>
-        <w:t xml:space="preserve">. В частности, хотя все эти исследования направлены на повышение доступности данных и информации, в них практически не рассматривается, как преодолеть разрыв между собственно обработкой изображений и последующим извлечением информации, с одной стороны, и соответствующим эффективным и качественным принятием решений — с другой.</w:t>
+        <w:t xml:space="preserve">. В частности, хотя все эти исследования направлены на повышение доступности данных и информации, в них практически не рассматривается, как преодолеть разрыв между собственно обработкой изображений и последующим извлечением информации, с одной стороны, и соответствующим эффективным и качественным принятием решений, с другой.</w:t>
       </w:r>
     </w:p>
     <w:p>
@@ -583,28 +583,28 @@
       <w:pPr>
         <w:spacing w:after="0" w:line="360"/>
         <w:ind w:firstLine="709"/>
-        <w:jc w:val="both"/>
-      </w:pPr>
-      <w:r>
-        <w:rPr>
-          <w:rFonts w:ascii="Times New Roman" w:cs="Times New Roman" w:eastAsia="Times New Roman" w:hAnsi="Times New Roman"/>
-          <w:sz w:val="28"/>
-          <w:szCs w:val="28"/>
-        </w:rPr>
-        <w:t xml:space="preserve">Цель настоящей работы — объединить два направления исследований. В ней прикладные исследования в области обработки изображений для </w:t>
-      </w:r>
-      <w:r>
-        <w:rPr>
-          <w:rFonts w:ascii="Times New Roman" w:cs="Times New Roman" w:eastAsia="Times New Roman" w:hAnsi="Times New Roman"/>
-          <w:b/>
-          <w:bCs/>
-          <w:i w:val="false"/>
-          <w:iCs w:val="false"/>
-          <w:color w:val="1F4E79"/>
-          <w:sz w:val="28"/>
-          <w:szCs w:val="28"/>
-        </w:rPr>
-        <w:t xml:space="preserve">технического обслуживания линий электропередачи</w:t>
+        <w:jc w:val="left"/>
+      </w:pPr>
+      <w:r>
+        <w:rPr>
+          <w:rFonts w:ascii="Times New Roman" w:cs="Times New Roman" w:eastAsia="Times New Roman" w:hAnsi="Times New Roman"/>
+          <w:sz w:val="28"/>
+          <w:szCs w:val="28"/>
+        </w:rPr>
+        <w:t xml:space="preserve">Данная работа направлена на объединение двух областей исследований. Она сочетает прикладные исследования в области обработки изображений при </w:t>
+      </w:r>
+      <w:r>
+        <w:rPr>
+          <w:rFonts w:ascii="Times New Roman" w:cs="Times New Roman" w:eastAsia="Times New Roman" w:hAnsi="Times New Roman"/>
+          <w:b/>
+          <w:bCs/>
+          <w:i w:val="false"/>
+          <w:iCs w:val="false"/>
+          <w:color w:val="1F4E79"/>
+          <w:sz w:val="28"/>
+          <w:szCs w:val="28"/>
+        </w:rPr>
+        <w:t xml:space="preserve">техническом обслуживании линий электропередачи</w:t>
       </w:r>
       <w:r>
         <w:rPr>
@@ -624,7 +624,7 @@
           <w:sz w:val="28"/>
           <w:szCs w:val="28"/>
         </w:rPr>
-        <w:t xml:space="preserve"> (ТО ЛЭП) сочетаются с потребностью в поддержке принятия решений в областях, </w:t>
+        <w:t xml:space="preserve"> (ТО ЛЭП) с потребностью в поддержке принятия решений в областях, </w:t>
       </w:r>
       <w:r>
         <w:rPr>
@@ -690,14 +690,14 @@
           <w:sz w:val="28"/>
           <w:szCs w:val="28"/>
         </w:rPr>
-        <w:t xml:space="preserve"> в частности. Это позволяет раскрыть новый потенциал за счёт того, что ранее недоступные данные и информация, содержащиеся в отдельных изображениях, становятся доступными.</w:t>
+        <w:t xml:space="preserve"> в частности. Это позволяет нам раскрыть новый потенциал за счёт того, что ранее недоступные данные и информация из отдельных изображений становятся доступными.</w:t>
       </w:r>
     </w:p>
     <w:p>
       <w:pPr>
         <w:spacing w:after="0" w:line="360"/>
         <w:ind w:firstLine="709"/>
-        <w:jc w:val="both"/>
+        <w:jc w:val="left"/>
       </w:pPr>
       <w:r>
         <w:rPr>
@@ -771,7 +771,7 @@
           <w:sz w:val="28"/>
           <w:szCs w:val="28"/>
         </w:rPr>
-        <w:t xml:space="preserve"> и уделяя основное внимание проектированию комплексного решения для поддержки принятия решений на основе изображений. Мы формируем знания о проектировании </w:t>
+        <w:t xml:space="preserve"> и уделяя основное внимание проектированию комплексного решения для поддержки принятия решений на основе изображений. Мы разрабатываем знания о проектировании </w:t>
       </w:r>
       <w:r>
         <w:rPr>
@@ -804,7 +804,7 @@
           <w:sz w:val="28"/>
           <w:szCs w:val="28"/>
         </w:rPr>
-        <w:t xml:space="preserve"> и оцениваем их, реализуя в виде конкретного артефакта для технического обслуживания </w:t>
+        <w:t xml:space="preserve"> и оцениваем их путём создания конкретного артефакта для технического обслуживания </w:t>
       </w:r>
       <w:r>
         <w:rPr>
@@ -837,7 +837,7 @@
           <w:sz w:val="28"/>
           <w:szCs w:val="28"/>
         </w:rPr>
-        <w:t xml:space="preserve">. Мы дополняем рассмотренные существующие работы (см. табл. 1) тем, что нам удаётся </w:t>
+        <w:t xml:space="preserve">. Мы расширяем рассмотренные существующие работы (см. табл. 1), поскольку нам удаётся </w:t>
       </w:r>
       <w:r>
         <w:rPr>
@@ -903,7 +903,7 @@
           <w:sz w:val="28"/>
           <w:szCs w:val="28"/>
         </w:rPr>
-        <w:t xml:space="preserve">, сильно различающиеся по размеру (</w:t>
+        <w:t xml:space="preserve"> с очень большой разницей в размерах (</w:t>
       </w:r>
       <w:r>
         <w:rPr>
@@ -969,7 +969,7 @@
           <w:sz w:val="28"/>
           <w:szCs w:val="28"/>
         </w:rPr>
-        <w:t xml:space="preserve">), что, по нашему мнению, является необходимым условием для перехода к поддержке принятия решений в данной области.</w:t>
+        <w:t xml:space="preserve">), что, по нашему мнению, является важнейшим предварительным условием для перехода к поддержке принятия решений в этой области.</w:t>
       </w:r>
     </w:p>
     <w:p>
@@ -992,15 +992,15 @@
       <w:pPr>
         <w:spacing w:after="0" w:line="360"/>
         <w:ind w:firstLine="709"/>
-        <w:jc w:val="both"/>
-      </w:pPr>
-      <w:r>
-        <w:rPr>
-          <w:rFonts w:ascii="Times New Roman" w:cs="Times New Roman" w:eastAsia="Times New Roman" w:hAnsi="Times New Roman"/>
-          <w:sz w:val="28"/>
-          <w:szCs w:val="28"/>
-        </w:rPr>
-        <w:t xml:space="preserve">В настоящем исследовании формируются знания о проектировании </w:t>
+        <w:jc w:val="left"/>
+      </w:pPr>
+      <w:r>
+        <w:rPr>
+          <w:rFonts w:ascii="Times New Roman" w:cs="Times New Roman" w:eastAsia="Times New Roman" w:hAnsi="Times New Roman"/>
+          <w:sz w:val="28"/>
+          <w:szCs w:val="28"/>
+        </w:rPr>
+        <w:t xml:space="preserve">В настоящем исследовании разрабатываются знания о проектировании </w:t>
       </w:r>
       <w:r>
         <w:rPr>
@@ -1033,7 +1033,7 @@
           <w:sz w:val="28"/>
           <w:szCs w:val="28"/>
         </w:rPr>
-        <w:t xml:space="preserve">, которая поддерживает принятие решений по техническому обслуживанию и планирование работ </w:t>
+        <w:t xml:space="preserve">, которая поддерживает принятие решений о техническом обслуживании и планирование работ </w:t>
       </w:r>
       <w:r>
         <w:rPr>
@@ -1066,7 +1066,7 @@
           <w:sz w:val="28"/>
           <w:szCs w:val="28"/>
         </w:rPr>
-        <w:t xml:space="preserve"> </w:t>
+        <w:t xml:space="preserve"> (ME) </w:t>
       </w:r>
       <w:r>
         <w:rPr>
@@ -1132,20 +1132,20 @@
           <w:sz w:val="28"/>
           <w:szCs w:val="28"/>
         </w:rPr>
-        <w:t xml:space="preserve"> (Design Science Research, DSR) зарекомендовало себя не только как подходящая, но и как важная парадигма разработки </w:t>
-      </w:r>
-      <w:r>
-        <w:rPr>
-          <w:rFonts w:ascii="Times New Roman" w:cs="Times New Roman" w:eastAsia="Times New Roman" w:hAnsi="Times New Roman"/>
-          <w:b/>
-          <w:bCs/>
-          <w:i w:val="false"/>
-          <w:iCs w:val="false"/>
-          <w:color w:val="1F4E79"/>
-          <w:sz w:val="28"/>
-          <w:szCs w:val="28"/>
-        </w:rPr>
-        <w:t xml:space="preserve">информационных систем</w:t>
+        <w:t xml:space="preserve"> (DSR) зарекомендовало себя не только как подходящая, но и как важная парадигма для разработки </w:t>
+      </w:r>
+      <w:r>
+        <w:rPr>
+          <w:rFonts w:ascii="Times New Roman" w:cs="Times New Roman" w:eastAsia="Times New Roman" w:hAnsi="Times New Roman"/>
+          <w:b/>
+          <w:bCs/>
+          <w:i w:val="false"/>
+          <w:iCs w:val="false"/>
+          <w:color w:val="1F4E79"/>
+          <w:sz w:val="28"/>
+          <w:szCs w:val="28"/>
+        </w:rPr>
+        <w:t xml:space="preserve">ИС</w:t>
       </w:r>
       <w:r>
         <w:rPr>
@@ -1198,7 +1198,7 @@
           <w:sz w:val="28"/>
           <w:szCs w:val="28"/>
         </w:rPr>
-        <w:t xml:space="preserve"> в частности (Arnott and Pervan 2012), мы следуем его этапам при разработке и оценке нашего артефакта. По своей сути </w:t>
+        <w:t xml:space="preserve"> в частности (Arnott and Pervan 2012), мы следуем его этапам для разработки и оценки нашего артефакта. По своей сути </w:t>
       </w:r>
       <w:r>
         <w:rPr>
@@ -1231,7 +1231,7 @@
           <w:sz w:val="28"/>
           <w:szCs w:val="28"/>
         </w:rPr>
-        <w:t xml:space="preserve"> представляет собой парадигму решения задач, которая включает два основных и чётко разграниченных вида деятельности, направленных на поиск решений реальных проблем: (1) разработку инновационных артефактов в ходе ряда проектных работ на основе глубокого понимания проблемы, обосновывающих знаний и возможностей исследователя и (2) оценку нового артефакта, чтобы определить, насколько он способен решить выявленную проблему и насколько он для этого полезен (Hevner et al. 2004). Следуя этому «циклу построения и оценки» (Hevner et al. 2004), мы итеративно разрабатываем артефакт, чтобы расширить </w:t>
+        <w:t xml:space="preserve"> — это парадигма решения задач, которая включает два основных и отличных друг от друга вида деятельности для проектирования решений реальных проблем: (1) разработку инновационных артефактов в ходе ряда проектных работ на основе глубокого понимания проблемы, обосновывающих знаний и возможностей исследователя и (2) оценку нового артефакта для определения его способности и полезности при решении выявленной проблемы (Hevner et al. 2004). Следуя этому «циклу построения и оценки» (Hevner et al. 2004), мы итеративно разрабатываем артефакт, чтобы расширить </w:t>
       </w:r>
       <w:r>
         <w:rPr>
@@ -1304,15 +1304,15 @@
       <w:pPr>
         <w:spacing w:after="0" w:line="360"/>
         <w:ind w:firstLine="709"/>
-        <w:jc w:val="both"/>
-      </w:pPr>
-      <w:r>
-        <w:rPr>
-          <w:rFonts w:ascii="Times New Roman" w:cs="Times New Roman" w:eastAsia="Times New Roman" w:hAnsi="Times New Roman"/>
-          <w:sz w:val="28"/>
-          <w:szCs w:val="28"/>
-        </w:rPr>
-        <w:t xml:space="preserve">Помимо этого цикла, который точнее называть циклом проектирования, Hevner (2007) выделяет ещё два цикла: цикл релевантности и цикл научной строгости. Все три цикла неразрывно связаны между собой и являются частью любого проекта </w:t>
+        <w:jc w:val="left"/>
+      </w:pPr>
+      <w:r>
+        <w:rPr>
+          <w:rFonts w:ascii="Times New Roman" w:cs="Times New Roman" w:eastAsia="Times New Roman" w:hAnsi="Times New Roman"/>
+          <w:sz w:val="28"/>
+          <w:szCs w:val="28"/>
+        </w:rPr>
+        <w:t xml:space="preserve">Помимо этого цикла, точнее называемого циклом проектирования, Hevner (2007) описывает существование двух дополнительных циклов: релевантности и строгости. Эти три цикла неразрывно связаны и являются частью любого проекта </w:t>
       </w:r>
       <w:r>
         <w:rPr>
@@ -1378,7 +1378,7 @@
           <w:sz w:val="28"/>
           <w:szCs w:val="28"/>
         </w:rPr>
-        <w:t xml:space="preserve"> или компанию, на базе которой проводится исследование, с деятельностью в рамках </w:t>
+        <w:t xml:space="preserve"> или компанию, на примере которой проводится исследовательский проект, с деятельностью в рамках </w:t>
       </w:r>
       <w:r>
         <w:rPr>
@@ -1411,7 +1411,7 @@
           <w:sz w:val="28"/>
           <w:szCs w:val="28"/>
         </w:rPr>
-        <w:t xml:space="preserve">, например за счёт учёта мнений экспертов-практиков. Он не только задаёт требования, проблемы и задачи исследования, но и определяет </w:t>
+        <w:t xml:space="preserve">, например за счёт учёта мнений экспертов-практиков. Он не только предоставляет требования, проблемы или задачи для исследования, но и определяет </w:t>
       </w:r>
       <w:r>
         <w:rPr>
@@ -1444,7 +1444,7 @@
           <w:sz w:val="28"/>
           <w:szCs w:val="28"/>
         </w:rPr>
-        <w:t xml:space="preserve"> (Hevner and Chatterjee 2010). Цикл научной строгости связывает деятельность в рамках </w:t>
+        <w:t xml:space="preserve"> (Hevner and Chatterjee 2010). Цикл строгости связывает деятельность в рамках </w:t>
       </w:r>
       <w:r>
         <w:rPr>
@@ -1510,7 +1510,7 @@
           <w:sz w:val="28"/>
           <w:szCs w:val="28"/>
         </w:rPr>
-        <w:t xml:space="preserve">. Он обеспечивает исследовательский проект знаниями, почерпнутыми из научных теорий, инженерных методов, опыта и экспертизы. Цикл проектирования, который, как правило, выполняется многократно, составляет ядро любого проекта </w:t>
+        <w:t xml:space="preserve">. Он предоставляет исследовательскому проекту знания из научных теорий, инженерных методов, опыта и экспертизы. Цикл проектирования, который часто выполняется многократно, является ядром любого проекта </w:t>
       </w:r>
       <w:r>
         <w:rPr>
@@ -1543,7 +1543,7 @@
           <w:sz w:val="28"/>
           <w:szCs w:val="28"/>
         </w:rPr>
-        <w:t xml:space="preserve"> и естественным образом опирается на результаты двух других циклов. В частности, в ходе цикла проектирования исследование итеративно чередует построение и оценку развивающегося артефакта (Hevner and Chatterjee 2010), чтобы в итоге </w:t>
+        <w:t xml:space="preserve"> и естественным образом опирается на результаты двух предыдущих циклов. В частности, в ходе цикла проектирования исследование итеративно чередует построение и оценку развивающегося артефакта (Hevner and Chatterjee 2010), чтобы в итоге </w:t>
       </w:r>
       <w:r>
         <w:rPr>
@@ -1576,7 +1576,7 @@
           <w:sz w:val="28"/>
           <w:szCs w:val="28"/>
         </w:rPr>
-        <w:t xml:space="preserve"> артефакт в целевой среде, а также обобщить полученные выводы и внести вклад исследования в виде знаний о проектировании в </w:t>
+        <w:t xml:space="preserve"> артефакт в среде, а также обобщить выводы и внести вклад исследования в виде знаний о проектировании в </w:t>
       </w:r>
       <w:r>
         <w:rPr>
@@ -1616,15 +1616,15 @@
       <w:pPr>
         <w:spacing w:after="0" w:line="360"/>
         <w:ind w:firstLine="709"/>
-        <w:jc w:val="both"/>
-      </w:pPr>
-      <w:r>
-        <w:rPr>
-          <w:rFonts w:ascii="Times New Roman" w:cs="Times New Roman" w:eastAsia="Times New Roman" w:hAnsi="Times New Roman"/>
-          <w:sz w:val="28"/>
-          <w:szCs w:val="28"/>
-        </w:rPr>
-        <w:t xml:space="preserve">Как показано на общей схеме нашего исследования (рис. 1), мы начинаем с изучения среды, в которую встроено исследование. Затем мы описываем прикладной кейс (разд. 4.1) и рассматриваем связанные с ним трудности и проблемы (разд. 4.2). Объединяя полученные выводы со знаниями из базовых теорий, мы концептуализируем принципы и требования для класса задач </w:t>
+        <w:jc w:val="left"/>
+      </w:pPr>
+      <w:r>
+        <w:rPr>
+          <w:rFonts w:ascii="Times New Roman" w:cs="Times New Roman" w:eastAsia="Times New Roman" w:hAnsi="Times New Roman"/>
+          <w:sz w:val="28"/>
+          <w:szCs w:val="28"/>
+        </w:rPr>
+        <w:t xml:space="preserve">В общем представлении нашего исследования, показанном на рис. 1, мы начинаем с изучения среды, в которой проводится исследование. Затем мы описываем наш прикладной случай (разд. 4.1) и рассматриваем связанные с ним трудности и проблемы (разд. 4.2). Объединяя эти выводы со знаниями из базовых теорий, мы концептуализируем принципы и требования для класса задач </w:t>
       </w:r>
       <w:r>
         <w:rPr>
@@ -1657,7 +1657,7 @@
           <w:sz w:val="28"/>
           <w:szCs w:val="28"/>
         </w:rPr>
-        <w:t xml:space="preserve">. Далее мы создаём конкретный артефакт для </w:t>
+        <w:t xml:space="preserve">. Далее мы получаем конкретный артефакт для </w:t>
       </w:r>
       <w:r>
         <w:rPr>
@@ -1690,7 +1690,7 @@
           <w:sz w:val="28"/>
           <w:szCs w:val="28"/>
         </w:rPr>
-        <w:t xml:space="preserve"> и, опираясь на общее представление о </w:t>
+        <w:t xml:space="preserve"> и, основываясь на общем понятии </w:t>
       </w:r>
       <w:r>
         <w:rPr>
@@ -1723,7 +1723,7 @@
           <w:sz w:val="28"/>
           <w:szCs w:val="28"/>
         </w:rPr>
-        <w:t xml:space="preserve">, предложенное Turban et al. (2010), в первом цикле проектирования сначала сосредотачиваемся на </w:t>
+        <w:t xml:space="preserve"> по Turban et al. (2010), в первом цикле проектирования сначала сосредоточиваемся на </w:t>
       </w:r>
       <w:r>
         <w:rPr>
@@ -1789,7 +1789,7 @@
           <w:sz w:val="28"/>
           <w:szCs w:val="28"/>
         </w:rPr>
-        <w:t xml:space="preserve"> (разд. 5.2). Затем во втором цикле проектирования мы переходим к </w:t>
+        <w:t xml:space="preserve"> (разд. 5.2). После этого во втором цикле проектирования мы переходим к </w:t>
       </w:r>
       <w:r>
         <w:rPr>
@@ -1840,7 +1840,7 @@
           <w:sz w:val="28"/>
           <w:szCs w:val="28"/>
         </w:rPr>
-        <w:t xml:space="preserve"> (Framework for Evaluation in Design Science; Venable et al. 2016), чтобы строго продемонстрировать полезность и эффективность артефакта и лежащих в его основе знаний о проектировании. На рисунке 1 представлен обзор эпизодов оценки (EE), проведённых в этих циклах проектирования. Поскольку наша цель — показать техническую реализуемость и полезность </w:t>
+        <w:t xml:space="preserve"> (Venable et al. 2016) и следуем ей, чтобы строго продемонстрировать полезность и эффективность артефакта и лежащих в его основе знаний о проектировании. На рисунке 1 представлен обзор выполненных эпизодов оценки (EE) в этих циклах проектирования. Поскольку наша цель — показать техническую реализуемость, а также полезность </w:t>
       </w:r>
       <w:r>
         <w:rPr>
@@ -1873,7 +1873,7 @@
           <w:sz w:val="28"/>
           <w:szCs w:val="28"/>
         </w:rPr>
-        <w:t xml:space="preserve">, построенных с применением </w:t>
+        <w:t xml:space="preserve">, реализованных с помощью </w:t>
       </w:r>
       <w:r>
         <w:rPr>
@@ -1906,7 +1906,7 @@
           <w:sz w:val="28"/>
           <w:szCs w:val="28"/>
         </w:rPr>
-        <w:t xml:space="preserve">, мы начинаем с технической оценки, а затем переходим к натуралистическому контексту, то есть к реальным условиям применения.</w:t>
+        <w:t xml:space="preserve">, мы начинаем с технической оценки, а затем переходим к натуралистическому контексту в условиях применения.</w:t>
       </w:r>
     </w:p>
     <w:p>
@@ -1922,14 +1922,14 @@
           <w:sz w:val="28"/>
           <w:szCs w:val="28"/>
         </w:rPr>
-        <w:t xml:space="preserve">4 Прикладной кейс и концептуализация</w:t>
+        <w:t xml:space="preserve">4 Прикладной случай и концептуализация</w:t>
       </w:r>
     </w:p>
     <w:p>
       <w:pPr>
         <w:spacing w:after="0" w:line="360"/>
         <w:ind w:firstLine="709"/>
-        <w:jc w:val="both"/>
+        <w:jc w:val="left"/>
       </w:pPr>
       <w:r>
         <w:rPr>
@@ -2016,7 +2016,7 @@
           <w:sz w:val="28"/>
           <w:szCs w:val="28"/>
         </w:rPr>
-        <w:t xml:space="preserve">ЛЭП</w:t>
+        <w:t xml:space="preserve">линий электропередачи</w:t>
       </w:r>
       <w:r>
         <w:rPr>
@@ -2036,20 +2036,20 @@
           <w:sz w:val="28"/>
           <w:szCs w:val="28"/>
         </w:rPr>
-        <w:t xml:space="preserve"> при принятии решений. Точнее, наша система помогает планировать отдельные </w:t>
-      </w:r>
-      <w:r>
-        <w:rPr>
-          <w:rFonts w:ascii="Times New Roman" w:cs="Times New Roman" w:eastAsia="Times New Roman" w:hAnsi="Times New Roman"/>
-          <w:b/>
-          <w:bCs/>
-          <w:i w:val="false"/>
-          <w:iCs w:val="false"/>
-          <w:color w:val="1F4E79"/>
-          <w:sz w:val="28"/>
-          <w:szCs w:val="28"/>
-        </w:rPr>
-        <w:t xml:space="preserve">наряды на техническое обслуживание</w:t>
+        <w:t xml:space="preserve"> при принятии решений. Точнее, наша система поддерживает планирование и определение объёма отдельных </w:t>
+      </w:r>
+      <w:r>
+        <w:rPr>
+          <w:rFonts w:ascii="Times New Roman" w:cs="Times New Roman" w:eastAsia="Times New Roman" w:hAnsi="Times New Roman"/>
+          <w:b/>
+          <w:bCs/>
+          <w:i w:val="false"/>
+          <w:iCs w:val="false"/>
+          <w:color w:val="1F4E79"/>
+          <w:sz w:val="28"/>
+          <w:szCs w:val="28"/>
+        </w:rPr>
+        <w:t xml:space="preserve">нарядов на техническое обслуживание</w:t>
       </w:r>
       <w:r>
         <w:rPr>
@@ -2069,7 +2069,7 @@
           <w:sz w:val="28"/>
           <w:szCs w:val="28"/>
         </w:rPr>
-        <w:t xml:space="preserve"> и определять объём работ по ремонту и замене элементов за счёт повышения качества данных и информации. Поскольку артефакт предназначен для работы в организационном контексте, он считается «</w:t>
+        <w:t xml:space="preserve"> для ремонта и замены компонентов за счёт повышения качества данных и информации. Поскольку артефакт должен функционировать в организационном контексте, он считается «</w:t>
       </w:r>
       <w:r>
         <w:rPr>
@@ -2102,20 +2102,20 @@
           <w:sz w:val="28"/>
           <w:szCs w:val="28"/>
         </w:rPr>
-        <w:t xml:space="preserve">» (Gregor and Hevner 2013). Чтобы справиться со сложностью построения артефакта с учётом его масштаба, а также социальных и технических составляющих, Gregor and Hevner (2013) предлагают явным образом выделять </w:t>
-      </w:r>
-      <w:r>
-        <w:rPr>
-          <w:rFonts w:ascii="Times New Roman" w:cs="Times New Roman" w:eastAsia="Times New Roman" w:hAnsi="Times New Roman"/>
-          <w:b/>
-          <w:bCs/>
-          <w:i w:val="false"/>
-          <w:iCs w:val="false"/>
-          <w:color w:val="1F4E79"/>
-          <w:sz w:val="28"/>
-          <w:szCs w:val="28"/>
-        </w:rPr>
-        <w:t xml:space="preserve">принципы проектирования</w:t>
+        <w:t xml:space="preserve">» (Gregor and Hevner 2013). Чтобы справиться со сложностью построения артефакта с точки зрения размера, а также социальных и технических компонентов, Gregor and Hevner (2013) предлагают явное выделение </w:t>
+      </w:r>
+      <w:r>
+        <w:rPr>
+          <w:rFonts w:ascii="Times New Roman" w:cs="Times New Roman" w:eastAsia="Times New Roman" w:hAnsi="Times New Roman"/>
+          <w:b/>
+          <w:bCs/>
+          <w:i w:val="false"/>
+          <w:iCs w:val="false"/>
+          <w:color w:val="1F4E79"/>
+          <w:sz w:val="28"/>
+          <w:szCs w:val="28"/>
+        </w:rPr>
+        <w:t xml:space="preserve">принципов проектирования</w:t>
       </w:r>
       <w:r>
         <w:rPr>
@@ -2135,7 +2135,7 @@
           <w:sz w:val="28"/>
           <w:szCs w:val="28"/>
         </w:rPr>
-        <w:t xml:space="preserve"> (DPs). Поэтому мы концептуализируем и предлагаем ряд предварительных </w:t>
+        <w:t xml:space="preserve"> (DP). Поэтому мы концептуализируем и предлагаем ряд предварительных </w:t>
       </w:r>
       <w:r>
         <w:rPr>
@@ -2168,7 +2168,7 @@
           <w:sz w:val="28"/>
           <w:szCs w:val="28"/>
         </w:rPr>
-        <w:t xml:space="preserve"> для создания артефактов класса задач </w:t>
+        <w:t xml:space="preserve"> для проектирования артефактов класса задач </w:t>
       </w:r>
       <w:r>
         <w:rPr>
@@ -2201,7 +2201,7 @@
           <w:sz w:val="28"/>
           <w:szCs w:val="28"/>
         </w:rPr>
-        <w:t xml:space="preserve">, предварительно изучив трудности, возникающие при </w:t>
+        <w:t xml:space="preserve">, сначала исследуя трудности в </w:t>
       </w:r>
       <w:r>
         <w:rPr>
@@ -2234,7 +2234,7 @@
           <w:sz w:val="28"/>
           <w:szCs w:val="28"/>
         </w:rPr>
-        <w:t xml:space="preserve"> (ТО ЛЭП). Эти трудности переформулируются в предписывающей форме с соответствующим уровнем абстракции, в результате чего формируются предварительные </w:t>
+        <w:t xml:space="preserve"> (ТО ЛЭП). Эти трудности переформулируются в предписывающей форме с соответствующим уровнем абстракции, в результате чего получаются предварительные </w:t>
       </w:r>
       <w:r>
         <w:rPr>
@@ -2267,7 +2267,7 @@
           <w:sz w:val="28"/>
           <w:szCs w:val="28"/>
         </w:rPr>
-        <w:t xml:space="preserve"> (DRs), которые затем служат основой для выработки </w:t>
+        <w:t xml:space="preserve"> (DR), которые затем служат основой для выведения </w:t>
       </w:r>
       <w:r>
         <w:rPr>

</xml_diff>